<commit_message>
Syncing with version 29.0.49455.0
</commit_message>
<xml_diff>
--- a/Apps/US/IRSForms/app/src/Printing/IRS 1099 Print.docx
+++ b/Apps/US/IRSForms/app/src/Printing/IRS 1099 Print.docx
@@ -167,12 +167,12 @@
         <w:tblStyle w:val="TableGrid"/>
         <w:tblW w:w="0" w:type="auto"/>
         <w:tblBorders>
-          <w:top w:val="none" w:sz="0" w:space="0" w:color="auto"/>
-          <w:left w:val="none" w:sz="0" w:space="0" w:color="auto"/>
-          <w:bottom w:val="none" w:sz="0" w:space="0" w:color="auto"/>
-          <w:right w:val="none" w:sz="0" w:space="0" w:color="auto"/>
-          <w:insideH w:val="none" w:sz="0" w:space="0" w:color="auto"/>
-          <w:insideV w:val="none" w:sz="0" w:space="0" w:color="auto"/>
+          <w:top w:val="none" w:color="auto" w:sz="0" w:space="0"/>
+          <w:left w:val="none" w:color="auto" w:sz="0" w:space="0"/>
+          <w:bottom w:val="none" w:color="auto" w:sz="0" w:space="0"/>
+          <w:right w:val="none" w:color="auto" w:sz="0" w:space="0"/>
+          <w:insideH w:val="none" w:color="auto" w:sz="0" w:space="0"/>
+          <w:insideV w:val="none" w:color="auto" w:sz="0" w:space="0"/>
         </w:tblBorders>
         <w:tblLook w:val="04A0" w:firstRow="1" w:lastRow="0" w:firstColumn="1" w:lastColumn="0" w:noHBand="0" w:noVBand="1"/>
       </w:tblPr>
@@ -348,8 +348,8 @@
         <w:tblStyle w:val="TableGrid"/>
         <w:tblW w:w="5000" w:type="pct"/>
         <w:tblBorders>
-          <w:insideH w:val="none" w:sz="0" w:space="0" w:color="auto"/>
-          <w:insideV w:val="none" w:sz="0" w:space="0" w:color="auto"/>
+          <w:insideH w:val="none" w:color="auto" w:sz="0" w:space="0"/>
+          <w:insideV w:val="none" w:color="auto" w:sz="0" w:space="0"/>
         </w:tblBorders>
         <w:tblLook w:val="04A0" w:firstRow="1" w:lastRow="0" w:firstColumn="1" w:lastColumn="0" w:noHBand="0" w:noVBand="1"/>
       </w:tblPr>
@@ -988,7 +988,7 @@
         <w:tblStyle w:val="TableGrid"/>
         <w:tblW w:w="0" w:type="auto"/>
         <w:tblBorders>
-          <w:insideV w:val="none" w:sz="0" w:space="0" w:color="auto"/>
+          <w:insideV w:val="none" w:color="auto" w:sz="0" w:space="0"/>
         </w:tblBorders>
         <w:tblLook w:val="04A0" w:firstRow="1" w:lastRow="0" w:firstColumn="1" w:lastColumn="0" w:noHBand="0" w:noVBand="1"/>
       </w:tblPr>
@@ -1049,7 +1049,7 @@
                     <w:placeholder>
                       <w:docPart w:val="DefaultPlaceholder_-1854013440"/>
                     </w:placeholder>
-                    <w15:dataBinding w:prefixMappings="xmlns:ns0='urn:microsoft-dynamics-nav/reports/IRS_1099_Create_Printable/10032/' " w:xpath="/ns0:NavWordReportXmlPart[1]/ns0:IRS1099FormDocHeader[1]/ns0:IRS1099ReportLine[1]/ns0:Line_Value[1]" w:storeItemID="{B3C4C3AA-F1FB-4274-B344-724B9FE87532}"/>
+                    <w15:dataBinding w:prefixMappings="xmlns:ns0='urn:microsoft-dynamics-nav/reports/IRS_1099_Print/10032/'" w:xpath="/ns0:NavWordReportXmlPart[1]/ns0:IRS1099FormDocHeader[1]/ns0:IRS1099ReportLine[1]/ns0:Line_Value[1]" w:storeItemID="{B3C4C3AA-F1FB-4274-B344-724B9FE87532}"/>
                   </w:sdtPr>
                   <w:sdtContent>
                     <w:tc>
@@ -1135,12 +1135,12 @@
         <w:tblW w:w="10260" w:type="dxa"/>
         <w:tblInd w:w="-360" w:type="dxa"/>
         <w:tblBorders>
-          <w:top w:val="none" w:sz="0" w:space="0" w:color="auto"/>
-          <w:left w:val="none" w:sz="0" w:space="0" w:color="auto"/>
-          <w:bottom w:val="none" w:sz="0" w:space="0" w:color="auto"/>
-          <w:right w:val="none" w:sz="0" w:space="0" w:color="auto"/>
-          <w:insideH w:val="none" w:sz="0" w:space="0" w:color="auto"/>
-          <w:insideV w:val="none" w:sz="0" w:space="0" w:color="auto"/>
+          <w:top w:val="none" w:color="auto" w:sz="0" w:space="0"/>
+          <w:left w:val="none" w:color="auto" w:sz="0" w:space="0"/>
+          <w:bottom w:val="none" w:color="auto" w:sz="0" w:space="0"/>
+          <w:right w:val="none" w:color="auto" w:sz="0" w:space="0"/>
+          <w:insideH w:val="none" w:color="auto" w:sz="0" w:space="0"/>
+          <w:insideV w:val="none" w:color="auto" w:sz="0" w:space="0"/>
         </w:tblBorders>
         <w:tblLook w:val="04A0" w:firstRow="1" w:lastRow="0" w:firstColumn="1" w:lastColumn="0" w:noHBand="0" w:noVBand="1"/>
       </w:tblPr>

</xml_diff>